<commit_message>
feat : modif des templates
</commit_message>
<xml_diff>
--- a/templates/ordre_mission_template_agent_abonnement_3_lignes.docx
+++ b/templates/ordre_mission_template_agent_abonnement_3_lignes.docx
@@ -5099,13 +5099,7 @@
               <w:rPr>
                 <w:rStyle w:val="Autres"/>
               </w:rPr>
-              <w:t xml:space="preserve">- Nom de la carte (formule tarifaire) : </w:t>
-            </w:r>
-            <w:r>
-              <w:rPr>
-                <w:rStyle w:val="Autres"/>
-              </w:rPr>
-              <w:t>{{nom_carte_abonnement}}</w:t>
+              <w:t>- Nom de la carte (formule tarifaire) : {{nom_carte_abonnement}}</w:t>
             </w:r>
           </w:p>
           <w:p>
@@ -5128,13 +5122,7 @@
               <w:rPr>
                 <w:rStyle w:val="Autres"/>
               </w:rPr>
-              <w:t xml:space="preserve">N° de carte : </w:t>
-            </w:r>
-            <w:r>
-              <w:rPr>
-                <w:rStyle w:val="Autres"/>
-              </w:rPr>
-              <w:t>{{numero_carte_abonnement}}</w:t>
+              <w:t>N° de carte : {{numero_carte_abonnement}}</w:t>
             </w:r>
           </w:p>
           <w:p>
@@ -5159,13 +5147,19 @@
               <w:rPr>
                 <w:rStyle w:val="Autres"/>
               </w:rPr>
-              <w:t xml:space="preserve">Date de validité de l’abonnement : </w:t>
-            </w:r>
-            <w:r>
-              <w:rPr>
-                <w:rStyle w:val="Autres"/>
-              </w:rPr>
-              <w:t>du {{debut_validité_carte_abonnemen}} au {{fin_validité_carte_abonnement}}</w:t>
+              <w:t>Date de validité de l’abonnement : du {{debut_validite_carte_abonnemen}} au {{fin_validit</w:t>
+            </w:r>
+            <w:r>
+              <w:rPr>
+                <w:rStyle w:val="Autres"/>
+              </w:rPr>
+              <w:t>e</w:t>
+            </w:r>
+            <w:r>
+              <w:rPr>
+                <w:rStyle w:val="Autres"/>
+              </w:rPr>
+              <w:t>_carte_abonnement}}</w:t>
             </w:r>
           </w:p>
           <w:p>

</xml_diff>